<commit_message>
Update: Refresh Resume.pdf and Resume.docx with latest edits
</commit_message>
<xml_diff>
--- a/Resume.docx
+++ b/Resume.docx
@@ -65,19 +65,7 @@
           <w:rPr>
             <w:rStyle w:val="Hyperlink"/>
           </w:rPr>
-          <w:t>vasanthkumar</w:t>
-        </w:r>
-        <w:r>
-          <w:rPr>
-            <w:rStyle w:val="Hyperlink"/>
-          </w:rPr>
-          <w:t>1</w:t>
-        </w:r>
-        <w:r>
-          <w:rPr>
-            <w:rStyle w:val="Hyperlink"/>
-          </w:rPr>
-          <w:t>9102005@gmail.com</w:t>
+          <w:t>vasanthkumar19102005@gmail.com</w:t>
         </w:r>
       </w:hyperlink>
       <w:r>
@@ -117,19 +105,7 @@
           <w:rPr>
             <w:rStyle w:val="Hyperlink"/>
           </w:rPr>
-          <w:t>: linkedi</w:t>
-        </w:r>
-        <w:r>
-          <w:rPr>
-            <w:rStyle w:val="Hyperlink"/>
-          </w:rPr>
-          <w:t>n</w:t>
-        </w:r>
-        <w:r>
-          <w:rPr>
-            <w:rStyle w:val="Hyperlink"/>
-          </w:rPr>
-          <w:t>.com/in/ vasanthkumarn1910</w:t>
+          <w:t>: linkedin.com/in/ vasanthkumarn1910</w:t>
         </w:r>
       </w:hyperlink>
     </w:p>
@@ -284,7 +260,7 @@
           <w:color w:val="156082" w:themeColor="accent1"/>
           <w:u w:val="single"/>
         </w:rPr>
-        <w:t>https://vasanth-nm.github.io/portfolio/</w:t>
+        <w:t>https://vasanth-nm.github.io/portfolio</w:t>
       </w:r>
     </w:p>
     <w:p>

</xml_diff>